<commit_message>
Corrige l'extraction et ajoute les fiches moniteurs
Deux défauts corrigés dans l'extraction des plannings :
- un export ne contenant qu'une seule colonne donnait une plage de
  largeur nulle, et tout le fichier était ignoré : le samedi perdait
  cinq cours, dont le privé de 12 h ;
- un élève dont la parenthèse fermante manque dans la source n'était
  pas reconnu, ce qui coûtait une inscription au jeudi.

Un recomptage sur le texte brut vérifie désormais chaque jour : 184
cours et 638 inscriptions, conformes à la source.

Ajoute une fiche par moniteur, une page par jour, avec des heures
calculées par union des créneaux — deux terrains à la même heure ne
comptent qu'une fois.

Co-Authored-By: Claude Opus 5 <noreply@anthropic.com>
Claude-Session: https://claude.ai/code/session_01RsDkbcD3KwyPviDTcs72WZ
</commit_message>
<xml_diff>
--- a/Fiche_Yassine_Cherqi_2026-2027.docx
+++ b/Fiche_Yassine_Cherqi_2026-2027.docx
@@ -7124,7 +7124,7 @@
                 <w:sz w:val="19"/>
                 <w:szCs w:val="19"/>
               </w:rPr>
-              <w:t xml:space="preserve">2 cours   ·   3 h   ·   8 élèves</w:t>
+              <w:t xml:space="preserve">3 cours   ·   2,5 h   ·   8 élèves</w:t>
             </w:r>
           </w:p>
         </w:tc>
@@ -7140,6 +7140,103 @@
           <w:color w:val="2E2E2E"/>
           <w:sz w:val="8"/>
           <w:szCs w:val="8"/>
+        </w:rPr>
+        <w:t xml:space="preserve"/>
+      </w:r>
+    </w:p>
+    <w:tbl>
+      <w:tblPr>
+        <w:tblW w:type="dxa" w:w="9637"/>
+        <w:tblBorders>
+          <w:top w:val="none" w:color="FFFFFF" w:sz="0"/>
+          <w:left w:val="none" w:color="FFFFFF" w:sz="0"/>
+          <w:bottom w:val="none" w:color="FFFFFF" w:sz="0"/>
+          <w:right w:val="none" w:color="FFFFFF" w:sz="0"/>
+          <w:insideH w:val="none" w:color="FFFFFF" w:sz="0"/>
+          <w:insideV w:val="none" w:color="FFFFFF" w:sz="0"/>
+        </w:tblBorders>
+      </w:tblPr>
+      <w:tblGrid>
+        <w:gridCol w:w="9637"/>
+      </w:tblGrid>
+      <w:tr>
+        <w:tc>
+          <w:tcPr>
+            <w:tcW w:type="dxa" w:w="9637"/>
+            <w:shd w:fill="8A9E28" w:color="auto" w:val="clear"/>
+            <w:tcMar>
+              <w:top w:type="dxa" w:w="85"/>
+              <w:left w:type="dxa" w:w="170"/>
+              <w:bottom w:type="dxa" w:w="85"/>
+              <w:right w:type="dxa" w:w="170"/>
+            </w:tcMar>
+            <w:vAlign w:val="center"/>
+          </w:tcPr>
+          <w:p>
+            <w:pPr>
+              <w:spacing w:after="0" w:before="0" w:line="250"/>
+            </w:pPr>
+            <w:r>
+              <w:rPr>
+                <w:rFonts w:ascii="Calibri" w:cs="Calibri" w:eastAsia="Calibri" w:hAnsi="Calibri"/>
+                <w:b/>
+                <w:bCs/>
+                <w:color w:val="FFFFFF"/>
+                <w:sz w:val="22"/>
+                <w:szCs w:val="22"/>
+              </w:rPr>
+              <w:t xml:space="preserve">12:00 – 13:00</w:t>
+            </w:r>
+            <w:r>
+              <w:rPr>
+                <w:rFonts w:ascii="Calibri" w:cs="Calibri" w:eastAsia="Calibri" w:hAnsi="Calibri"/>
+                <w:color w:val="FFFFFF"/>
+                <w:sz w:val="19"/>
+                <w:szCs w:val="19"/>
+              </w:rPr>
+              <w:t xml:space="preserve">      Terrain 6</w:t>
+            </w:r>
+            <w:r>
+              <w:rPr>
+                <w:rFonts w:ascii="Calibri" w:cs="Calibri" w:eastAsia="Calibri" w:hAnsi="Calibri"/>
+                <w:b/>
+                <w:bCs/>
+                <w:color w:val="FFFFFF"/>
+                <w:sz w:val="22"/>
+                <w:szCs w:val="22"/>
+              </w:rPr>
+              <w:t xml:space="preserve">      Privé Vova</w:t>
+            </w:r>
+          </w:p>
+        </w:tc>
+      </w:tr>
+    </w:tbl>
+    <w:p>
+      <w:pPr>
+        <w:spacing w:after="40" w:before="80" w:line="250"/>
+      </w:pPr>
+      <w:r>
+        <w:rPr>
+          <w:rFonts w:ascii="Calibri" w:cs="Calibri" w:eastAsia="Calibri" w:hAnsi="Calibri"/>
+          <w:i/>
+          <w:iCs/>
+          <w:color w:val="6E6E6E"/>
+          <w:sz w:val="18"/>
+          <w:szCs w:val="18"/>
+        </w:rPr>
+        <w:t xml:space="preserve">     Cours privé — pas de liste d’élèves.</w:t>
+      </w:r>
+    </w:p>
+    <w:p>
+      <w:pPr>
+        <w:spacing w:after="190" w:before="0" w:line="250"/>
+      </w:pPr>
+      <w:r>
+        <w:rPr>
+          <w:rFonts w:ascii="Calibri" w:cs="Calibri" w:eastAsia="Calibri" w:hAnsi="Calibri"/>
+          <w:color w:val="2E2E2E"/>
+          <w:sz w:val="10"/>
+          <w:szCs w:val="10"/>
         </w:rPr>
         <w:t xml:space="preserve"/>
       </w:r>
@@ -7828,7 +7925,7 @@
         <w:sz w:val="15"/>
         <w:szCs w:val="15"/>
       </w:rPr>
-      <w:t xml:space="preserve">Yassine Cherqi  ·  26 cours  ·  33 h par semaine  ·  Saison 2026-2027</w:t>
+      <w:t xml:space="preserve">Yassine Cherqi  ·  27 cours  ·  32,5 h par semaine  ·  Saison 2026-2027</w:t>
     </w:r>
   </w:p>
 </w:ftr>

</xml_diff>